<commit_message>
Reset failed attempts immediately
</commit_message>
<xml_diff>
--- a/docs/弹珠_游戏设计文档_v1.0.docx
+++ b/docs/弹珠_游戏设计文档_v1.0.docx
@@ -209,7 +209,7 @@
                 <w:color w:val="172033"/>
                 <w:sz w:val="20"/>
               </w:rPr>
-              <w:t>2026-08-12</w:t>
+              <w:t>2026-08-13</w:t>
             </w:r>
           </w:p>
         </w:tc>
@@ -600,7 +600,7 @@
           <w:color w:val="172033"/>
           <w:sz w:val="22"/>
         </w:rPr>
-        <w:t xml:space="preserve"> 开关状态只能由同一颗仍在本次尝试中的球继续利用。球可以被发射器接住后再次发射，但一旦失败，机关会在下一次尝试时复位。</w:t>
+        <w:t xml:space="preserve"> 开关状态只能由同一颗仍在本次尝试中的球继续利用。球可以被发射器接住后再次发射，但一旦失败，机关会立即复位并准备下一次尝试。</w:t>
       </w:r>
     </w:p>
     <w:p>
@@ -1072,7 +1072,7 @@
           <w:color w:val="172033"/>
           <w:sz w:val="22"/>
         </w:rPr>
-        <w:t>失败后再次发射：从 A1 开始新尝试，开关、门和移动机关复位。</w:t>
+        <w:t>失败判定成立：立即从 A1 准备新尝试，开关、门和移动机关同步复位。</w:t>
       </w:r>
     </w:p>
     <w:p>
@@ -1696,7 +1696,7 @@
           <w:color w:val="172033"/>
           <w:sz w:val="22"/>
         </w:rPr>
-        <w:t>失败后，画面可以短暂保留失败结果供玩家观察。玩家下一次从 A1 发射前，系统会统一复位：</w:t>
+        <w:t>失败判定成立后，系统立即统一复位，不再等待玩家按下下一次发射：</w:t>
       </w:r>
     </w:p>
     <w:p>
@@ -1799,6 +1799,23 @@
           <w:sz w:val="22"/>
         </w:rPr>
         <w:t>球重新由 A1 持有。</w:t>
+      </w:r>
+    </w:p>
+    <w:p>
+      <w:pPr>
+        <w:spacing w:after="80" w:line="300" w:lineRule="auto"/>
+        <w:numPr>
+          <w:ilvl w:val="0"/>
+          <w:numId w:val="10"/>
+        </w:numPr>
+      </w:pPr>
+      <w:r>
+        <w:rPr>
+          <w:rFonts w:ascii="Calibri" w:hAnsi="Calibri" w:eastAsia="Microsoft YaHei"/>
+          <w:color w:val="172033"/>
+          <w:sz w:val="22"/>
+        </w:rPr>
+        <w:t>上一发的失败轨迹不随复位清除，仍按原有时长短暂显示。</w:t>
       </w:r>
     </w:p>
     <w:p>
@@ -2432,7 +2449,7 @@
           <w:color w:val="172033"/>
           <w:sz w:val="22"/>
         </w:rPr>
-        <w:t>发射器按钮文字显示“有球”“空”或“重开”。</w:t>
+        <w:t>发射器按钮文字显示“有球”或“空”。</w:t>
       </w:r>
     </w:p>
     <w:p>
@@ -2899,7 +2916,7 @@
           <w:color w:val="1F4D78"/>
           <w:sz w:val="17"/>
         </w:rPr>
-        <w:t xml:space="preserve">                         下一次从 A1 重开并复位机关</w:t>
+        <w:t xml:space="preserve">                         立即复位机关，A1 重新持球</w:t>
       </w:r>
     </w:p>
     <w:p>
@@ -4680,7 +4697,7 @@
           <w:color w:val="172033"/>
           <w:sz w:val="22"/>
         </w:rPr>
-        <w:t>球失败后，下一次发射会让移动机关回到关卡初始状态。</w:t>
+        <w:t>球失败后，移动机关立即回到关卡初始状态。</w:t>
       </w:r>
     </w:p>
     <w:p>
@@ -5217,7 +5234,7 @@
           <w:color w:val="172033"/>
           <w:sz w:val="22"/>
         </w:rPr>
-        <w:t>下一次从 A1 发射：按钮恢复 OFF，红门重新关闭。</w:t>
+        <w:t>失败判定成立：按钮立即恢复 OFF，红门立即重新关闭，A1 重新持球。</w:t>
       </w:r>
     </w:p>
     <w:p>
@@ -6233,7 +6250,7 @@
           <w:color w:val="172033"/>
           <w:sz w:val="22"/>
         </w:rPr>
-        <w:t>发射器状态按钮直接显示有球、空或重开。</w:t>
+        <w:t>发射器状态按钮直接显示有球或空。</w:t>
       </w:r>
     </w:p>
     <w:p>
@@ -10639,7 +10656,7 @@
           <w:color w:val="172033"/>
           <w:sz w:val="22"/>
         </w:rPr>
-        <w:t>☐ 球失败后，下一次从 A1 发射前复位全部机关。</w:t>
+        <w:t>☐ 球失败判定成立后立即复位全部机关，并让 A1 重新持球。</w:t>
       </w:r>
     </w:p>
     <w:p>
@@ -10656,7 +10673,7 @@
           <w:color w:val="172033"/>
           <w:sz w:val="22"/>
         </w:rPr>
-        <w:t>☐ 主动重置立即复位关卡。</w:t>
+        <w:t>☐ 失败立即复位后，上一发的细实线轨迹仍按原有规则保留。</w:t>
       </w:r>
     </w:p>
     <w:p>
@@ -10673,21 +10690,7 @@
           <w:color w:val="172033"/>
           <w:sz w:val="22"/>
         </w:rPr>
-        <w:t>☐ 所有发射器力度均为 700。</w:t>
-      </w:r>
-    </w:p>
-    <w:p>
-      <w:pPr>
-        <w:pStyle w:val="Heading2"/>
-      </w:pPr>
-      <w:r>
-        <w:rPr>
-          <w:rFonts w:ascii="Calibri" w:hAnsi="Calibri" w:eastAsia="Microsoft YaHei"/>
-          <w:b/>
-          <w:color w:val="2E74B5"/>
-          <w:sz w:val="26"/>
-        </w:rPr>
-        <w:t>16.2 关卡验收</w:t>
+        <w:t>☐ 主动重置立即复位关卡。</w:t>
       </w:r>
     </w:p>
     <w:p>
@@ -10704,7 +10707,21 @@
           <w:color w:val="172033"/>
           <w:sz w:val="22"/>
         </w:rPr>
-        <w:t>☐ 25 个官方关卡编号连续。</w:t>
+        <w:t>☐ 所有发射器力度均为 700。</w:t>
+      </w:r>
+    </w:p>
+    <w:p>
+      <w:pPr>
+        <w:pStyle w:val="Heading2"/>
+      </w:pPr>
+      <w:r>
+        <w:rPr>
+          <w:rFonts w:ascii="Calibri" w:hAnsi="Calibri" w:eastAsia="Microsoft YaHei"/>
+          <w:b/>
+          <w:color w:val="2E74B5"/>
+          <w:sz w:val="26"/>
+        </w:rPr>
+        <w:t>16.2 关卡验收</w:t>
       </w:r>
     </w:p>
     <w:p>
@@ -10721,7 +10738,7 @@
           <w:color w:val="172033"/>
           <w:sz w:val="22"/>
         </w:rPr>
-        <w:t>☐ 每关至少有一条经过物理模拟验证的推荐解法。</w:t>
+        <w:t>☐ 25 个官方关卡编号连续。</w:t>
       </w:r>
     </w:p>
     <w:p>
@@ -10738,7 +10755,7 @@
           <w:color w:val="172033"/>
           <w:sz w:val="22"/>
         </w:rPr>
-        <w:t>☐ 推荐路线中标记为关键的墙确实被使用。</w:t>
+        <w:t>☐ 每关至少有一条经过物理模拟验证的推荐解法。</w:t>
       </w:r>
     </w:p>
     <w:p>
@@ -10755,7 +10772,7 @@
           <w:color w:val="172033"/>
           <w:sz w:val="22"/>
         </w:rPr>
-        <w:t>☐ 推荐路线不会意外碰到作为陷阱的卸力物体。</w:t>
+        <w:t>☐ 推荐路线中标记为关键的墙确实被使用。</w:t>
       </w:r>
     </w:p>
     <w:p>
@@ -10772,7 +10789,7 @@
           <w:color w:val="172033"/>
           <w:sz w:val="22"/>
         </w:rPr>
-        <w:t>☐ 移动机关既有可通过窗口，也有会阻挡的时刻。</w:t>
+        <w:t>☐ 推荐路线不会意外碰到作为陷阱的卸力物体。</w:t>
       </w:r>
     </w:p>
     <w:p>
@@ -10789,7 +10806,7 @@
           <w:color w:val="172033"/>
           <w:sz w:val="22"/>
         </w:rPr>
-        <w:t>☐ 不需要外框反弹的关卡，推荐路线不依赖外框。</w:t>
+        <w:t>☐ 移动机关既有可通过窗口，也有会阻挡的时刻。</w:t>
       </w:r>
     </w:p>
     <w:p>
@@ -10806,21 +10823,7 @@
           <w:color w:val="172033"/>
           <w:sz w:val="22"/>
         </w:rPr>
-        <w:t>☐ R 发射器只在中后期关卡出现。</w:t>
-      </w:r>
-    </w:p>
-    <w:p>
-      <w:pPr>
-        <w:pStyle w:val="Heading2"/>
-      </w:pPr>
-      <w:r>
-        <w:rPr>
-          <w:rFonts w:ascii="Calibri" w:hAnsi="Calibri" w:eastAsia="Microsoft YaHei"/>
-          <w:b/>
-          <w:color w:val="2E74B5"/>
-          <w:sz w:val="26"/>
-        </w:rPr>
-        <w:t>16.3 编辑器验收</w:t>
+        <w:t>☐ 不需要外框反弹的关卡，推荐路线不依赖外框。</w:t>
       </w:r>
     </w:p>
     <w:p>
@@ -10837,7 +10840,21 @@
           <w:color w:val="172033"/>
           <w:sz w:val="22"/>
         </w:rPr>
-        <w:t>☐ 可新建、命名、试玩和保存关卡。</w:t>
+        <w:t>☐ R 发射器只在中后期关卡出现。</w:t>
+      </w:r>
+    </w:p>
+    <w:p>
+      <w:pPr>
+        <w:pStyle w:val="Heading2"/>
+      </w:pPr>
+      <w:r>
+        <w:rPr>
+          <w:rFonts w:ascii="Calibri" w:hAnsi="Calibri" w:eastAsia="Microsoft YaHei"/>
+          <w:b/>
+          <w:color w:val="2E74B5"/>
+          <w:sz w:val="26"/>
+        </w:rPr>
+        <w:t>16.3 编辑器验收</w:t>
       </w:r>
     </w:p>
     <w:p>
@@ -10854,7 +10871,7 @@
           <w:color w:val="172033"/>
           <w:sz w:val="22"/>
         </w:rPr>
-        <w:t>☐ 可重新编辑官方和自定义关卡。</w:t>
+        <w:t>☐ 可新建、命名、试玩和保存关卡。</w:t>
       </w:r>
     </w:p>
     <w:p>
@@ -10871,7 +10888,7 @@
           <w:color w:val="172033"/>
           <w:sz w:val="22"/>
         </w:rPr>
-        <w:t>☐ 未保存退出提示正确区分保存和放弃。</w:t>
+        <w:t>☐ 可重新编辑官方和自定义关卡。</w:t>
       </w:r>
     </w:p>
     <w:p>
@@ -10888,7 +10905,7 @@
           <w:color w:val="172033"/>
           <w:sz w:val="22"/>
         </w:rPr>
-        <w:t>☐ 试玩后可回编辑器继续修改。</w:t>
+        <w:t>☐ 未保存退出提示正确区分保存和放弃。</w:t>
       </w:r>
     </w:p>
     <w:p>
@@ -10905,7 +10922,7 @@
           <w:color w:val="172033"/>
           <w:sz w:val="22"/>
         </w:rPr>
-        <w:t>☐ 撤销、重做、拖动、旋转和缩放正确。</w:t>
+        <w:t>☐ 试玩后可回编辑器继续修改。</w:t>
       </w:r>
     </w:p>
     <w:p>
@@ -10922,7 +10939,7 @@
           <w:color w:val="172033"/>
           <w:sz w:val="22"/>
         </w:rPr>
-        <w:t>☐ 新关卡不能添加第二个开局有球 A 发射器。</w:t>
+        <w:t>☐ 撤销、重做、拖动、旋转和缩放正确。</w:t>
       </w:r>
     </w:p>
     <w:p>
@@ -10939,6 +10956,23 @@
           <w:color w:val="172033"/>
           <w:sz w:val="22"/>
         </w:rPr>
+        <w:t>☐ 新关卡不能添加第二个开局有球 A 发射器。</w:t>
+      </w:r>
+    </w:p>
+    <w:p>
+      <w:pPr>
+        <w:spacing w:after="80" w:line="300" w:lineRule="auto"/>
+        <w:numPr>
+          <w:ilvl w:val="0"/>
+          <w:numId w:val="10"/>
+        </w:numPr>
+      </w:pPr>
+      <w:r>
+        <w:rPr>
+          <w:rFonts w:ascii="Calibri" w:hAnsi="Calibri" w:eastAsia="Microsoft YaHei"/>
+          <w:color w:val="172033"/>
+          <w:sz w:val="22"/>
+        </w:rPr>
         <w:t>☐ R 在编辑器中标记为初始为空。</w:t>
       </w:r>
     </w:p>
@@ -11223,7 +11257,7 @@
           <w:color w:val="172033"/>
           <w:sz w:val="22"/>
         </w:rPr>
-        <w:t xml:space="preserve"> 失败后的机关在下一次从 A1 发射前复位；主动重置则立即复位。</w:t>
+        <w:t xml:space="preserve"> 球停止或被卸力区域吸住并确认失败时，机关立即复位且 A1 重新持球；发射器成功接球时不复位。</w:t>
       </w:r>
     </w:p>
     <w:p>
@@ -11368,6 +11402,23 @@
           <w:sz w:val="32"/>
         </w:rPr>
         <w:t>18. 文档维护规则</w:t>
+      </w:r>
+    </w:p>
+    <w:p>
+      <w:pPr>
+        <w:spacing w:after="80" w:line="300" w:lineRule="auto"/>
+        <w:numPr>
+          <w:ilvl w:val="0"/>
+          <w:numId w:val="10"/>
+        </w:numPr>
+      </w:pPr>
+      <w:r>
+        <w:rPr>
+          <w:rFonts w:ascii="Calibri" w:hAnsi="Calibri" w:eastAsia="Microsoft YaHei"/>
+          <w:color w:val="172033"/>
+          <w:sz w:val="22"/>
+        </w:rPr>
+        <w:t>未经关卡作者明确许可，不得修改任何已设计、已编辑或已保存关卡的名称、布局、坐标、组件和推荐路线；新的关卡创意只能通过新增关卡实现。</w:t>
       </w:r>
     </w:p>
     <w:p>
@@ -11521,7 +11572,7 @@
         <w:color w:val="64748B"/>
         <w:sz w:val="18"/>
       </w:rPr>
-      <w:t xml:space="preserve">    规则基线 · 2026-08-12</w:t>
+      <w:t xml:space="preserve">    规则基线 · 2026-08-13</w:t>
     </w:r>
   </w:p>
 </w:hdr>

</xml_diff>

<commit_message>
Remove shot count tracking
</commit_message>
<xml_diff>
--- a/docs/弹珠_游戏设计文档_v1.0.docx
+++ b/docs/弹珠_游戏设计文档_v1.0.docx
@@ -1765,23 +1765,6 @@
           <w:sz w:val="22"/>
         </w:rPr>
         <w:t>本次尝试累计的机关使用记录清空。</w:t>
-      </w:r>
-    </w:p>
-    <w:p>
-      <w:pPr>
-        <w:spacing w:after="80" w:line="300" w:lineRule="auto"/>
-        <w:numPr>
-          <w:ilvl w:val="0"/>
-          <w:numId w:val="10"/>
-        </w:numPr>
-      </w:pPr>
-      <w:r>
-        <w:rPr>
-          <w:rFonts w:ascii="Calibri" w:hAnsi="Calibri" w:eastAsia="Microsoft YaHei"/>
-          <w:color w:val="172033"/>
-          <w:sz w:val="22"/>
-        </w:rPr>
-        <w:t>发射次数重新从 1 计算。</w:t>
       </w:r>
     </w:p>
     <w:p>
@@ -2930,7 +2913,7 @@
           <w:color w:val="2E74B5"/>
           <w:sz w:val="26"/>
         </w:rPr>
-        <w:t>4.7 发射次数</w:t>
+        <w:t>4.7 发射计数</w:t>
       </w:r>
     </w:p>
     <w:p>
@@ -2947,7 +2930,7 @@
           <w:color w:val="172033"/>
           <w:sz w:val="22"/>
         </w:rPr>
-        <w:t>每一次玩家主动按下发射都记为 1 次。</w:t>
+        <w:t>游戏不显示发射次数。</w:t>
       </w:r>
     </w:p>
     <w:p>
@@ -2964,7 +2947,7 @@
           <w:color w:val="172033"/>
           <w:sz w:val="22"/>
         </w:rPr>
-        <w:t>从 A1 发射计数。</w:t>
+        <w:t>游戏不累计或保存发射次数。</w:t>
       </w:r>
     </w:p>
     <w:p>
@@ -2981,41 +2964,7 @@
           <w:color w:val="172033"/>
           <w:sz w:val="22"/>
         </w:rPr>
-        <w:t>从 R 发射也计数。</w:t>
-      </w:r>
-    </w:p>
-    <w:p>
-      <w:pPr>
-        <w:spacing w:after="80" w:line="300" w:lineRule="auto"/>
-        <w:numPr>
-          <w:ilvl w:val="0"/>
-          <w:numId w:val="10"/>
-        </w:numPr>
-      </w:pPr>
-      <w:r>
-        <w:rPr>
-          <w:rFonts w:ascii="Calibri" w:hAnsi="Calibri" w:eastAsia="Microsoft YaHei"/>
-          <w:color w:val="172033"/>
-          <w:sz w:val="22"/>
-        </w:rPr>
-        <w:t>球进入发射器但尚未再次发射，不增加次数。</w:t>
-      </w:r>
-    </w:p>
-    <w:p>
-      <w:pPr>
-        <w:spacing w:after="80" w:line="300" w:lineRule="auto"/>
-        <w:numPr>
-          <w:ilvl w:val="0"/>
-          <w:numId w:val="10"/>
-        </w:numPr>
-      </w:pPr>
-      <w:r>
-        <w:rPr>
-          <w:rFonts w:ascii="Calibri" w:hAnsi="Calibri" w:eastAsia="Microsoft YaHei"/>
-          <w:color w:val="172033"/>
-          <w:sz w:val="22"/>
-        </w:rPr>
-        <w:t>失败后的新尝试会重新计算次数。</w:t>
+        <w:t>通关结果不使用发射次数进行评分或评价。</w:t>
       </w:r>
     </w:p>
     <w:p>
@@ -6233,7 +6182,7 @@
           <w:color w:val="172033"/>
           <w:sz w:val="22"/>
         </w:rPr>
-        <w:t>控制面板显示关卡编号、名称、考验方向、发射次数和当前发射器。</w:t>
+        <w:t>控制面板显示关卡编号、名称、考验方向和当前发射器。</w:t>
       </w:r>
     </w:p>
     <w:p>
@@ -10441,7 +10390,7 @@
           <w:color w:val="172033"/>
           <w:sz w:val="22"/>
         </w:rPr>
-        <w:t>当前没有关卡锁、星级、评分、最佳次数或永久通关进度。</w:t>
+        <w:t>当前没有关卡锁、星级、评分、发射次数统计或永久通关进度。</w:t>
       </w:r>
     </w:p>
     <w:p>
@@ -11275,7 +11224,7 @@
           <w:color w:val="172033"/>
           <w:sz w:val="22"/>
         </w:rPr>
-        <w:t>发射次数：</w:t>
+        <w:t>发射计数：</w:t>
       </w:r>
       <w:r>
         <w:rPr>
@@ -11283,7 +11232,7 @@
           <w:color w:val="172033"/>
           <w:sz w:val="22"/>
         </w:rPr>
-        <w:t xml:space="preserve"> 每次手动发射计数，包括从 R 发射；新尝试重新计数。</w:t>
+        <w:t xml:space="preserve"> 游戏不显示、累计、保存或评价发射次数。</w:t>
       </w:r>
     </w:p>
     <w:p>

</xml_diff>

<commit_message>
Add scrollable level selection
</commit_message>
<xml_diff>
--- a/docs/弹珠_游戏设计文档_v1.0.docx
+++ b/docs/弹珠_游戏设计文档_v1.0.docx
@@ -764,7 +764,7 @@
           <w:color w:val="172033"/>
           <w:sz w:val="22"/>
         </w:rPr>
-        <w:t>关卡菜单：横向每行 5 关，所有关卡均可直接选择，不设解锁门槛。</w:t>
+        <w:t>关卡菜单：固定每行 5 关，列表可纵向滚动，所有关卡均可直接选择，不设解锁门槛。</w:t>
       </w:r>
     </w:p>
     <w:p>
@@ -6101,6 +6101,40 @@
           <w:sz w:val="22"/>
         </w:rPr>
         <w:t>官方关卡按顺序编号，每行 5 个正方形入口。</w:t>
+      </w:r>
+    </w:p>
+    <w:p>
+      <w:pPr>
+        <w:spacing w:after="80" w:line="300" w:lineRule="auto"/>
+        <w:numPr>
+          <w:ilvl w:val="0"/>
+          <w:numId w:val="10"/>
+        </w:numPr>
+      </w:pPr>
+      <w:r>
+        <w:rPr>
+          <w:rFonts w:ascii="Calibri" w:hAnsi="Calibri" w:eastAsia="Microsoft YaHei"/>
+          <w:color w:val="172033"/>
+          <w:sz w:val="22"/>
+        </w:rPr>
+        <w:t>关卡入口位于独立的纵向滚动窗口中，上方标题与编辑器入口保持固定。</w:t>
+      </w:r>
+    </w:p>
+    <w:p>
+      <w:pPr>
+        <w:spacing w:after="80" w:line="300" w:lineRule="auto"/>
+        <w:numPr>
+          <w:ilvl w:val="0"/>
+          <w:numId w:val="10"/>
+        </w:numPr>
+      </w:pPr>
+      <w:r>
+        <w:rPr>
+          <w:rFonts w:ascii="Calibri" w:hAnsi="Calibri" w:eastAsia="Microsoft YaHei"/>
+          <w:color w:val="172033"/>
+          <w:sz w:val="22"/>
+        </w:rPr>
+        <w:t>玩家可以使用鼠标滚轮、触控板、触摸滑动或拖动右侧滚动条浏览全部关卡。</w:t>
       </w:r>
     </w:p>
     <w:p>

</xml_diff>

<commit_message>
Upgrade neon industrial art direction
</commit_message>
<xml_diff>
--- a/docs/弹珠_游戏设计文档_v1.0.docx
+++ b/docs/弹珠_游戏设计文档_v1.0.docx
@@ -5902,7 +5902,7 @@
           <w:color w:val="172033"/>
           <w:sz w:val="22"/>
         </w:rPr>
-        <w:t>黑色和深色金属为基础。</w:t>
+        <w:t>当前统一视觉主题为“霓虹工业机库”：以黑色、石墨和枪灰机械结构为主体，以克制的霓虹灯带表达玩法状态。</w:t>
       </w:r>
     </w:p>
     <w:p>
@@ -5919,7 +5919,7 @@
           <w:color w:val="172033"/>
           <w:sz w:val="22"/>
         </w:rPr>
-        <w:t>霓虹绿、蓝、紫、红、黄作为功能色。</w:t>
+        <w:t>画面约 70% 为哑光深色结构、20% 为冷色金属高光和文字、10% 为功能色及瞬时反馈。</w:t>
       </w:r>
     </w:p>
     <w:p>
@@ -5936,7 +5936,7 @@
           <w:color w:val="172033"/>
           <w:sz w:val="22"/>
         </w:rPr>
-        <w:t>参考未来科技、80 年代电玩厅和三维弹球机的视觉语言。</w:t>
+        <w:t>参考未来科技、80 年代电玩厅和三维弹球机的视觉语言，不直接复制任何既有作品的标识、角色或具体资产。</w:t>
       </w:r>
     </w:p>
     <w:p>
@@ -5953,21 +5953,7 @@
           <w:color w:val="172033"/>
           <w:sz w:val="22"/>
         </w:rPr>
-        <w:t>颜色优先表达规则，装饰不能影响组件辨认。</w:t>
-      </w:r>
-    </w:p>
-    <w:p>
-      <w:pPr>
-        <w:pStyle w:val="Heading2"/>
-      </w:pPr>
-      <w:r>
-        <w:rPr>
-          <w:rFonts w:ascii="Calibri" w:hAnsi="Calibri" w:eastAsia="Microsoft YaHei"/>
-          <w:b/>
-          <w:color w:val="2E74B5"/>
-          <w:sz w:val="26"/>
-        </w:rPr>
-        <w:t>11.2 开始界面</w:t>
+        <w:t>霓虹必须表达功能、状态、碰撞或通关反馈，不能作为无意义装饰。</w:t>
       </w:r>
     </w:p>
     <w:p>
@@ -5984,7 +5970,7 @@
           <w:color w:val="172033"/>
           <w:sz w:val="22"/>
         </w:rPr>
-        <w:t>背景为暗色霓虹弹球封面图。</w:t>
+        <w:t>颜色不能成为唯一识别方式；每种组件还必须通过轮廓、纹理、状态文字或动画区分。</w:t>
       </w:r>
     </w:p>
     <w:p>
@@ -6001,7 +5987,1302 @@
           <w:color w:val="172033"/>
           <w:sz w:val="22"/>
         </w:rPr>
-        <w:t>标题“弹珠”为艺术拼接字，并带弹珠滑过字面的轨道感。</w:t>
+        <w:t>高亮度只留给弹珠、B 点中心、当前有球发射器和刚发生的交互，避免全屏光污染。</w:t>
+      </w:r>
+    </w:p>
+    <w:p>
+      <w:pPr>
+        <w:pStyle w:val="Heading2"/>
+      </w:pPr>
+      <w:r>
+        <w:rPr>
+          <w:rFonts w:ascii="Calibri" w:hAnsi="Calibri" w:eastAsia="Microsoft YaHei"/>
+          <w:b/>
+          <w:color w:val="2E74B5"/>
+          <w:sz w:val="26"/>
+        </w:rPr>
+        <w:t>11.2 功能色与材质规则</w:t>
+      </w:r>
+    </w:p>
+    <w:tbl>
+      <w:tblPr>
+        <w:tblStyle w:val="TableGrid"/>
+        <w:tblW w:type="dxa" w:w="9360"/>
+        <w:tblLayout w:type="fixed"/>
+        <w:tblLook w:firstColumn="1" w:firstRow="1" w:lastColumn="0" w:lastRow="0" w:noHBand="0" w:noVBand="1" w:val="04A0"/>
+        <w:tblInd w:w="120" w:type="dxa"/>
+      </w:tblPr>
+      <w:tblGrid>
+        <w:gridCol w:w="1600"/>
+        <w:gridCol w:w="1600"/>
+        <w:gridCol w:w="2300"/>
+        <w:gridCol w:w="3860"/>
+      </w:tblGrid>
+      <w:tr>
+        <w:trPr>
+          <w:tblHeader w:val="true"/>
+        </w:trPr>
+        <w:tc>
+          <w:tcPr>
+            <w:tcW w:type="dxa" w:w="1600"/>
+            <w:tcMar>
+              <w:top w:w="80" w:type="dxa"/>
+              <w:start w:w="120" w:type="dxa"/>
+              <w:bottom w:w="80" w:type="dxa"/>
+              <w:end w:w="120" w:type="dxa"/>
+            </w:tcMar>
+            <w:vAlign w:val="center"/>
+            <w:shd w:fill="E8EEF5"/>
+          </w:tcPr>
+          <w:p>
+            <w:pPr>
+              <w:spacing w:before="0" w:after="20" w:line="259" w:lineRule="auto"/>
+              <w:jc w:val="center"/>
+            </w:pPr>
+            <w:r>
+              <w:rPr>
+                <w:rFonts w:ascii="Calibri" w:hAnsi="Calibri" w:eastAsia="Microsoft YaHei"/>
+                <w:b/>
+                <w:color w:val="1F4D78"/>
+                <w:sz w:val="19"/>
+              </w:rPr>
+              <w:t>对象</w:t>
+            </w:r>
+          </w:p>
+        </w:tc>
+        <w:tc>
+          <w:tcPr>
+            <w:tcW w:type="dxa" w:w="1600"/>
+            <w:tcMar>
+              <w:top w:w="80" w:type="dxa"/>
+              <w:start w:w="120" w:type="dxa"/>
+              <w:bottom w:w="80" w:type="dxa"/>
+              <w:end w:w="120" w:type="dxa"/>
+            </w:tcMar>
+            <w:vAlign w:val="center"/>
+            <w:shd w:fill="E8EEF5"/>
+          </w:tcPr>
+          <w:p>
+            <w:pPr>
+              <w:spacing w:before="0" w:after="20" w:line="259" w:lineRule="auto"/>
+            </w:pPr>
+            <w:r>
+              <w:rPr>
+                <w:rFonts w:ascii="Calibri" w:hAnsi="Calibri" w:eastAsia="Microsoft YaHei"/>
+                <w:b/>
+                <w:color w:val="1F4D78"/>
+                <w:sz w:val="19"/>
+              </w:rPr>
+              <w:t>主要颜色</w:t>
+            </w:r>
+          </w:p>
+        </w:tc>
+        <w:tc>
+          <w:tcPr>
+            <w:tcW w:type="dxa" w:w="2300"/>
+            <w:tcMar>
+              <w:top w:w="80" w:type="dxa"/>
+              <w:start w:w="120" w:type="dxa"/>
+              <w:bottom w:w="80" w:type="dxa"/>
+              <w:end w:w="120" w:type="dxa"/>
+            </w:tcMar>
+            <w:vAlign w:val="center"/>
+            <w:shd w:fill="E8EEF5"/>
+          </w:tcPr>
+          <w:p>
+            <w:pPr>
+              <w:spacing w:before="0" w:after="20" w:line="259" w:lineRule="auto"/>
+            </w:pPr>
+            <w:r>
+              <w:rPr>
+                <w:rFonts w:ascii="Calibri" w:hAnsi="Calibri" w:eastAsia="Microsoft YaHei"/>
+                <w:b/>
+                <w:color w:val="1F4D78"/>
+                <w:sz w:val="19"/>
+              </w:rPr>
+              <w:t>视觉结构</w:t>
+            </w:r>
+          </w:p>
+        </w:tc>
+        <w:tc>
+          <w:tcPr>
+            <w:tcW w:type="dxa" w:w="3860"/>
+            <w:tcMar>
+              <w:top w:w="80" w:type="dxa"/>
+              <w:start w:w="120" w:type="dxa"/>
+              <w:bottom w:w="80" w:type="dxa"/>
+              <w:end w:w="120" w:type="dxa"/>
+            </w:tcMar>
+            <w:vAlign w:val="center"/>
+            <w:shd w:fill="E8EEF5"/>
+          </w:tcPr>
+          <w:p>
+            <w:pPr>
+              <w:spacing w:before="0" w:after="20" w:line="259" w:lineRule="auto"/>
+            </w:pPr>
+            <w:r>
+              <w:rPr>
+                <w:rFonts w:ascii="Calibri" w:hAnsi="Calibri" w:eastAsia="Microsoft YaHei"/>
+                <w:b/>
+                <w:color w:val="1F4D78"/>
+                <w:sz w:val="19"/>
+              </w:rPr>
+              <w:t>表达含义</w:t>
+            </w:r>
+          </w:p>
+        </w:tc>
+      </w:tr>
+      <w:tr>
+        <w:tc>
+          <w:tcPr>
+            <w:tcW w:type="dxa" w:w="1600"/>
+            <w:tcMar>
+              <w:top w:w="80" w:type="dxa"/>
+              <w:start w:w="120" w:type="dxa"/>
+              <w:bottom w:w="80" w:type="dxa"/>
+              <w:end w:w="120" w:type="dxa"/>
+            </w:tcMar>
+            <w:vAlign w:val="center"/>
+          </w:tcPr>
+          <w:p>
+            <w:pPr>
+              <w:spacing w:before="0" w:after="20" w:line="259" w:lineRule="auto"/>
+              <w:jc w:val="center"/>
+            </w:pPr>
+            <w:r>
+              <w:rPr>
+                <w:rFonts w:ascii="Calibri" w:hAnsi="Calibri" w:eastAsia="Microsoft YaHei"/>
+                <w:color w:val="172033"/>
+                <w:sz w:val="19"/>
+              </w:rPr>
+              <w:t>系统界面与定位网格</w:t>
+            </w:r>
+          </w:p>
+        </w:tc>
+        <w:tc>
+          <w:tcPr>
+            <w:tcW w:type="dxa" w:w="1600"/>
+            <w:tcMar>
+              <w:top w:w="80" w:type="dxa"/>
+              <w:start w:w="120" w:type="dxa"/>
+              <w:bottom w:w="80" w:type="dxa"/>
+              <w:end w:w="120" w:type="dxa"/>
+            </w:tcMar>
+            <w:vAlign w:val="center"/>
+          </w:tcPr>
+          <w:p>
+            <w:pPr>
+              <w:spacing w:before="0" w:after="20" w:line="259" w:lineRule="auto"/>
+            </w:pPr>
+            <w:r>
+              <w:rPr>
+                <w:rFonts w:ascii="Calibri" w:hAnsi="Calibri" w:eastAsia="Microsoft YaHei"/>
+                <w:color w:val="172033"/>
+                <w:sz w:val="19"/>
+              </w:rPr>
+              <w:t>青色</w:t>
+            </w:r>
+          </w:p>
+        </w:tc>
+        <w:tc>
+          <w:tcPr>
+            <w:tcW w:type="dxa" w:w="2300"/>
+            <w:tcMar>
+              <w:top w:w="80" w:type="dxa"/>
+              <w:start w:w="120" w:type="dxa"/>
+              <w:bottom w:w="80" w:type="dxa"/>
+              <w:end w:w="120" w:type="dxa"/>
+            </w:tcMar>
+            <w:vAlign w:val="center"/>
+          </w:tcPr>
+          <w:p>
+            <w:pPr>
+              <w:spacing w:before="0" w:after="20" w:line="259" w:lineRule="auto"/>
+            </w:pPr>
+            <w:r>
+              <w:rPr>
+                <w:rFonts w:ascii="Calibri" w:hAnsi="Calibri" w:eastAsia="Microsoft YaHei"/>
+                <w:color w:val="172033"/>
+                <w:sz w:val="19"/>
+              </w:rPr>
+              <w:t>细线、角标、扫描线</w:t>
+            </w:r>
+          </w:p>
+        </w:tc>
+        <w:tc>
+          <w:tcPr>
+            <w:tcW w:type="dxa" w:w="3860"/>
+            <w:tcMar>
+              <w:top w:w="80" w:type="dxa"/>
+              <w:start w:w="120" w:type="dxa"/>
+              <w:bottom w:w="80" w:type="dxa"/>
+              <w:end w:w="120" w:type="dxa"/>
+            </w:tcMar>
+            <w:vAlign w:val="center"/>
+          </w:tcPr>
+          <w:p>
+            <w:pPr>
+              <w:spacing w:before="0" w:after="20" w:line="259" w:lineRule="auto"/>
+            </w:pPr>
+            <w:r>
+              <w:rPr>
+                <w:rFonts w:ascii="Calibri" w:hAnsi="Calibri" w:eastAsia="Microsoft YaHei"/>
+                <w:color w:val="172033"/>
+                <w:sz w:val="19"/>
+              </w:rPr>
+              <w:t>信息、焦点和可操作状态</w:t>
+            </w:r>
+          </w:p>
+        </w:tc>
+      </w:tr>
+      <w:tr>
+        <w:tc>
+          <w:tcPr>
+            <w:tcW w:type="dxa" w:w="1600"/>
+            <w:tcMar>
+              <w:top w:w="80" w:type="dxa"/>
+              <w:start w:w="120" w:type="dxa"/>
+              <w:bottom w:w="80" w:type="dxa"/>
+              <w:end w:w="120" w:type="dxa"/>
+            </w:tcMar>
+            <w:vAlign w:val="center"/>
+          </w:tcPr>
+          <w:p>
+            <w:pPr>
+              <w:spacing w:before="0" w:after="20" w:line="259" w:lineRule="auto"/>
+              <w:jc w:val="center"/>
+            </w:pPr>
+            <w:r>
+              <w:rPr>
+                <w:rFonts w:ascii="Calibri" w:hAnsi="Calibri" w:eastAsia="Microsoft YaHei"/>
+                <w:color w:val="172033"/>
+                <w:sz w:val="19"/>
+              </w:rPr>
+              <w:t>有球发射器</w:t>
+            </w:r>
+          </w:p>
+        </w:tc>
+        <w:tc>
+          <w:tcPr>
+            <w:tcW w:type="dxa" w:w="1600"/>
+            <w:tcMar>
+              <w:top w:w="80" w:type="dxa"/>
+              <w:start w:w="120" w:type="dxa"/>
+              <w:bottom w:w="80" w:type="dxa"/>
+              <w:end w:w="120" w:type="dxa"/>
+            </w:tcMar>
+            <w:vAlign w:val="center"/>
+          </w:tcPr>
+          <w:p>
+            <w:pPr>
+              <w:spacing w:before="0" w:after="20" w:line="259" w:lineRule="auto"/>
+            </w:pPr>
+            <w:r>
+              <w:rPr>
+                <w:rFonts w:ascii="Calibri" w:hAnsi="Calibri" w:eastAsia="Microsoft YaHei"/>
+                <w:color w:val="172033"/>
+                <w:sz w:val="19"/>
+              </w:rPr>
+              <w:t>绿色</w:t>
+            </w:r>
+          </w:p>
+        </w:tc>
+        <w:tc>
+          <w:tcPr>
+            <w:tcW w:type="dxa" w:w="2300"/>
+            <w:tcMar>
+              <w:top w:w="80" w:type="dxa"/>
+              <w:start w:w="120" w:type="dxa"/>
+              <w:bottom w:w="80" w:type="dxa"/>
+              <w:end w:w="120" w:type="dxa"/>
+            </w:tcMar>
+            <w:vAlign w:val="center"/>
+          </w:tcPr>
+          <w:p>
+            <w:pPr>
+              <w:spacing w:before="0" w:after="20" w:line="259" w:lineRule="auto"/>
+            </w:pPr>
+            <w:r>
+              <w:rPr>
+                <w:rFonts w:ascii="Calibri" w:hAnsi="Calibri" w:eastAsia="Microsoft YaHei"/>
+                <w:color w:val="172033"/>
+                <w:sz w:val="19"/>
+              </w:rPr>
+              <w:t>实心能源核心、旋转灯环、机械炮管</w:t>
+            </w:r>
+          </w:p>
+        </w:tc>
+        <w:tc>
+          <w:tcPr>
+            <w:tcW w:type="dxa" w:w="3860"/>
+            <w:tcMar>
+              <w:top w:w="80" w:type="dxa"/>
+              <w:start w:w="120" w:type="dxa"/>
+              <w:bottom w:w="80" w:type="dxa"/>
+              <w:end w:w="120" w:type="dxa"/>
+            </w:tcMar>
+            <w:vAlign w:val="center"/>
+          </w:tcPr>
+          <w:p>
+            <w:pPr>
+              <w:spacing w:before="0" w:after="20" w:line="259" w:lineRule="auto"/>
+            </w:pPr>
+            <w:r>
+              <w:rPr>
+                <w:rFonts w:ascii="Calibri" w:hAnsi="Calibri" w:eastAsia="Microsoft YaHei"/>
+                <w:color w:val="172033"/>
+                <w:sz w:val="19"/>
+              </w:rPr>
+              <w:t>当前有球，可瞄准发射</w:t>
+            </w:r>
+          </w:p>
+        </w:tc>
+      </w:tr>
+      <w:tr>
+        <w:tc>
+          <w:tcPr>
+            <w:tcW w:type="dxa" w:w="1600"/>
+            <w:tcMar>
+              <w:top w:w="80" w:type="dxa"/>
+              <w:start w:w="120" w:type="dxa"/>
+              <w:bottom w:w="80" w:type="dxa"/>
+              <w:end w:w="120" w:type="dxa"/>
+            </w:tcMar>
+            <w:vAlign w:val="center"/>
+          </w:tcPr>
+          <w:p>
+            <w:pPr>
+              <w:spacing w:before="0" w:after="20" w:line="259" w:lineRule="auto"/>
+              <w:jc w:val="center"/>
+            </w:pPr>
+            <w:r>
+              <w:rPr>
+                <w:rFonts w:ascii="Calibri" w:hAnsi="Calibri" w:eastAsia="Microsoft YaHei"/>
+                <w:color w:val="172033"/>
+                <w:sz w:val="19"/>
+              </w:rPr>
+              <w:t>空发射器</w:t>
+            </w:r>
+          </w:p>
+        </w:tc>
+        <w:tc>
+          <w:tcPr>
+            <w:tcW w:type="dxa" w:w="1600"/>
+            <w:tcMar>
+              <w:top w:w="80" w:type="dxa"/>
+              <w:start w:w="120" w:type="dxa"/>
+              <w:bottom w:w="80" w:type="dxa"/>
+              <w:end w:w="120" w:type="dxa"/>
+            </w:tcMar>
+            <w:vAlign w:val="center"/>
+          </w:tcPr>
+          <w:p>
+            <w:pPr>
+              <w:spacing w:before="0" w:after="20" w:line="259" w:lineRule="auto"/>
+            </w:pPr>
+            <w:r>
+              <w:rPr>
+                <w:rFonts w:ascii="Calibri" w:hAnsi="Calibri" w:eastAsia="Microsoft YaHei"/>
+                <w:color w:val="172033"/>
+                <w:sz w:val="19"/>
+              </w:rPr>
+              <w:t>紫色</w:t>
+            </w:r>
+          </w:p>
+        </w:tc>
+        <w:tc>
+          <w:tcPr>
+            <w:tcW w:type="dxa" w:w="2300"/>
+            <w:tcMar>
+              <w:top w:w="80" w:type="dxa"/>
+              <w:start w:w="120" w:type="dxa"/>
+              <w:bottom w:w="80" w:type="dxa"/>
+              <w:end w:w="120" w:type="dxa"/>
+            </w:tcMar>
+            <w:vAlign w:val="center"/>
+          </w:tcPr>
+          <w:p>
+            <w:pPr>
+              <w:spacing w:before="0" w:after="20" w:line="259" w:lineRule="auto"/>
+            </w:pPr>
+            <w:r>
+              <w:rPr>
+                <w:rFonts w:ascii="Calibri" w:hAnsi="Calibri" w:eastAsia="Microsoft YaHei"/>
+                <w:color w:val="172033"/>
+                <w:sz w:val="19"/>
+              </w:rPr>
+              <w:t>空心灯环、低亮能源舱</w:t>
+            </w:r>
+          </w:p>
+        </w:tc>
+        <w:tc>
+          <w:tcPr>
+            <w:tcW w:type="dxa" w:w="3860"/>
+            <w:tcMar>
+              <w:top w:w="80" w:type="dxa"/>
+              <w:start w:w="120" w:type="dxa"/>
+              <w:bottom w:w="80" w:type="dxa"/>
+              <w:end w:w="120" w:type="dxa"/>
+            </w:tcMar>
+            <w:vAlign w:val="center"/>
+          </w:tcPr>
+          <w:p>
+            <w:pPr>
+              <w:spacing w:before="0" w:after="20" w:line="259" w:lineRule="auto"/>
+            </w:pPr>
+            <w:r>
+              <w:rPr>
+                <w:rFonts w:ascii="Calibri" w:hAnsi="Calibri" w:eastAsia="Microsoft YaHei"/>
+                <w:color w:val="172033"/>
+                <w:sz w:val="19"/>
+              </w:rPr>
+              <w:t>可接球，当前不能发射</w:t>
+            </w:r>
+          </w:p>
+        </w:tc>
+      </w:tr>
+      <w:tr>
+        <w:tc>
+          <w:tcPr>
+            <w:tcW w:type="dxa" w:w="1600"/>
+            <w:tcMar>
+              <w:top w:w="80" w:type="dxa"/>
+              <w:start w:w="120" w:type="dxa"/>
+              <w:bottom w:w="80" w:type="dxa"/>
+              <w:end w:w="120" w:type="dxa"/>
+            </w:tcMar>
+            <w:vAlign w:val="center"/>
+          </w:tcPr>
+          <w:p>
+            <w:pPr>
+              <w:spacing w:before="0" w:after="20" w:line="259" w:lineRule="auto"/>
+              <w:jc w:val="center"/>
+            </w:pPr>
+            <w:r>
+              <w:rPr>
+                <w:rFonts w:ascii="Calibri" w:hAnsi="Calibri" w:eastAsia="Microsoft YaHei"/>
+                <w:color w:val="172033"/>
+                <w:sz w:val="19"/>
+              </w:rPr>
+              <w:t>普通墙</w:t>
+            </w:r>
+          </w:p>
+        </w:tc>
+        <w:tc>
+          <w:tcPr>
+            <w:tcW w:type="dxa" w:w="1600"/>
+            <w:tcMar>
+              <w:top w:w="80" w:type="dxa"/>
+              <w:start w:w="120" w:type="dxa"/>
+              <w:bottom w:w="80" w:type="dxa"/>
+              <w:end w:w="120" w:type="dxa"/>
+            </w:tcMar>
+            <w:vAlign w:val="center"/>
+          </w:tcPr>
+          <w:p>
+            <w:pPr>
+              <w:spacing w:before="0" w:after="20" w:line="259" w:lineRule="auto"/>
+            </w:pPr>
+            <w:r>
+              <w:rPr>
+                <w:rFonts w:ascii="Calibri" w:hAnsi="Calibri" w:eastAsia="Microsoft YaHei"/>
+                <w:color w:val="172033"/>
+                <w:sz w:val="19"/>
+              </w:rPr>
+              <w:t>枪灰色</w:t>
+            </w:r>
+          </w:p>
+        </w:tc>
+        <w:tc>
+          <w:tcPr>
+            <w:tcW w:type="dxa" w:w="2300"/>
+            <w:tcMar>
+              <w:top w:w="80" w:type="dxa"/>
+              <w:start w:w="120" w:type="dxa"/>
+              <w:bottom w:w="80" w:type="dxa"/>
+              <w:end w:w="120" w:type="dxa"/>
+            </w:tcMar>
+            <w:vAlign w:val="center"/>
+          </w:tcPr>
+          <w:p>
+            <w:pPr>
+              <w:spacing w:before="0" w:after="20" w:line="259" w:lineRule="auto"/>
+            </w:pPr>
+            <w:r>
+              <w:rPr>
+                <w:rFonts w:ascii="Calibri" w:hAnsi="Calibri" w:eastAsia="Microsoft YaHei"/>
+                <w:color w:val="172033"/>
+                <w:sz w:val="19"/>
+              </w:rPr>
+              <w:t>双层装甲边、接缝、铆钉</w:t>
+            </w:r>
+          </w:p>
+        </w:tc>
+        <w:tc>
+          <w:tcPr>
+            <w:tcW w:type="dxa" w:w="3860"/>
+            <w:tcMar>
+              <w:top w:w="80" w:type="dxa"/>
+              <w:start w:w="120" w:type="dxa"/>
+              <w:bottom w:w="80" w:type="dxa"/>
+              <w:end w:w="120" w:type="dxa"/>
+            </w:tcMar>
+            <w:vAlign w:val="center"/>
+          </w:tcPr>
+          <w:p>
+            <w:pPr>
+              <w:spacing w:before="0" w:after="20" w:line="259" w:lineRule="auto"/>
+            </w:pPr>
+            <w:r>
+              <w:rPr>
+                <w:rFonts w:ascii="Calibri" w:hAnsi="Calibri" w:eastAsia="Microsoft YaHei"/>
+                <w:color w:val="172033"/>
+                <w:sz w:val="19"/>
+              </w:rPr>
+              <w:t>普通反弹</w:t>
+            </w:r>
+          </w:p>
+        </w:tc>
+      </w:tr>
+      <w:tr>
+        <w:tc>
+          <w:tcPr>
+            <w:tcW w:type="dxa" w:w="1600"/>
+            <w:tcMar>
+              <w:top w:w="80" w:type="dxa"/>
+              <w:start w:w="120" w:type="dxa"/>
+              <w:bottom w:w="80" w:type="dxa"/>
+              <w:end w:w="120" w:type="dxa"/>
+            </w:tcMar>
+            <w:vAlign w:val="center"/>
+          </w:tcPr>
+          <w:p>
+            <w:pPr>
+              <w:spacing w:before="0" w:after="20" w:line="259" w:lineRule="auto"/>
+              <w:jc w:val="center"/>
+            </w:pPr>
+            <w:r>
+              <w:rPr>
+                <w:rFonts w:ascii="Calibri" w:hAnsi="Calibri" w:eastAsia="Microsoft YaHei"/>
+                <w:color w:val="172033"/>
+                <w:sz w:val="19"/>
+              </w:rPr>
+              <w:t>弹力墙</w:t>
+            </w:r>
+          </w:p>
+        </w:tc>
+        <w:tc>
+          <w:tcPr>
+            <w:tcW w:type="dxa" w:w="1600"/>
+            <w:tcMar>
+              <w:top w:w="80" w:type="dxa"/>
+              <w:start w:w="120" w:type="dxa"/>
+              <w:bottom w:w="80" w:type="dxa"/>
+              <w:end w:w="120" w:type="dxa"/>
+            </w:tcMar>
+            <w:vAlign w:val="center"/>
+          </w:tcPr>
+          <w:p>
+            <w:pPr>
+              <w:spacing w:before="0" w:after="20" w:line="259" w:lineRule="auto"/>
+            </w:pPr>
+            <w:r>
+              <w:rPr>
+                <w:rFonts w:ascii="Calibri" w:hAnsi="Calibri" w:eastAsia="Microsoft YaHei"/>
+                <w:color w:val="172033"/>
+                <w:sz w:val="19"/>
+              </w:rPr>
+              <w:t>绿色</w:t>
+            </w:r>
+          </w:p>
+        </w:tc>
+        <w:tc>
+          <w:tcPr>
+            <w:tcW w:type="dxa" w:w="2300"/>
+            <w:tcMar>
+              <w:top w:w="80" w:type="dxa"/>
+              <w:start w:w="120" w:type="dxa"/>
+              <w:bottom w:w="80" w:type="dxa"/>
+              <w:end w:w="120" w:type="dxa"/>
+            </w:tcMar>
+            <w:vAlign w:val="center"/>
+          </w:tcPr>
+          <w:p>
+            <w:pPr>
+              <w:spacing w:before="0" w:after="20" w:line="259" w:lineRule="auto"/>
+            </w:pPr>
+            <w:r>
+              <w:rPr>
+                <w:rFonts w:ascii="Calibri" w:hAnsi="Calibri" w:eastAsia="Microsoft YaHei"/>
+                <w:color w:val="172033"/>
+                <w:sz w:val="19"/>
+              </w:rPr>
+              <w:t>能量槽、流动斜纹、绿色轮廓</w:t>
+            </w:r>
+          </w:p>
+        </w:tc>
+        <w:tc>
+          <w:tcPr>
+            <w:tcW w:type="dxa" w:w="3860"/>
+            <w:tcMar>
+              <w:top w:w="80" w:type="dxa"/>
+              <w:start w:w="120" w:type="dxa"/>
+              <w:bottom w:w="80" w:type="dxa"/>
+              <w:end w:w="120" w:type="dxa"/>
+            </w:tcMar>
+            <w:vAlign w:val="center"/>
+          </w:tcPr>
+          <w:p>
+            <w:pPr>
+              <w:spacing w:before="0" w:after="20" w:line="259" w:lineRule="auto"/>
+            </w:pPr>
+            <w:r>
+              <w:rPr>
+                <w:rFonts w:ascii="Calibri" w:hAnsi="Calibri" w:eastAsia="Microsoft YaHei"/>
+                <w:color w:val="172033"/>
+                <w:sz w:val="19"/>
+              </w:rPr>
+              <w:t>反弹并提高速度</w:t>
+            </w:r>
+          </w:p>
+        </w:tc>
+      </w:tr>
+      <w:tr>
+        <w:tc>
+          <w:tcPr>
+            <w:tcW w:type="dxa" w:w="1600"/>
+            <w:tcMar>
+              <w:top w:w="80" w:type="dxa"/>
+              <w:start w:w="120" w:type="dxa"/>
+              <w:bottom w:w="80" w:type="dxa"/>
+              <w:end w:w="120" w:type="dxa"/>
+            </w:tcMar>
+            <w:vAlign w:val="center"/>
+          </w:tcPr>
+          <w:p>
+            <w:pPr>
+              <w:spacing w:before="0" w:after="20" w:line="259" w:lineRule="auto"/>
+              <w:jc w:val="center"/>
+            </w:pPr>
+            <w:r>
+              <w:rPr>
+                <w:rFonts w:ascii="Calibri" w:hAnsi="Calibri" w:eastAsia="Microsoft YaHei"/>
+                <w:color w:val="172033"/>
+                <w:sz w:val="19"/>
+              </w:rPr>
+              <w:t>卸力墙</w:t>
+            </w:r>
+          </w:p>
+        </w:tc>
+        <w:tc>
+          <w:tcPr>
+            <w:tcW w:type="dxa" w:w="1600"/>
+            <w:tcMar>
+              <w:top w:w="80" w:type="dxa"/>
+              <w:start w:w="120" w:type="dxa"/>
+              <w:bottom w:w="80" w:type="dxa"/>
+              <w:end w:w="120" w:type="dxa"/>
+            </w:tcMar>
+            <w:vAlign w:val="center"/>
+          </w:tcPr>
+          <w:p>
+            <w:pPr>
+              <w:spacing w:before="0" w:after="20" w:line="259" w:lineRule="auto"/>
+            </w:pPr>
+            <w:r>
+              <w:rPr>
+                <w:rFonts w:ascii="Calibri" w:hAnsi="Calibri" w:eastAsia="Microsoft YaHei"/>
+                <w:color w:val="172033"/>
+                <w:sz w:val="19"/>
+              </w:rPr>
+              <w:t>黄色</w:t>
+            </w:r>
+          </w:p>
+        </w:tc>
+        <w:tc>
+          <w:tcPr>
+            <w:tcW w:type="dxa" w:w="2300"/>
+            <w:tcMar>
+              <w:top w:w="80" w:type="dxa"/>
+              <w:start w:w="120" w:type="dxa"/>
+              <w:bottom w:w="80" w:type="dxa"/>
+              <w:end w:w="120" w:type="dxa"/>
+            </w:tcMar>
+            <w:vAlign w:val="center"/>
+          </w:tcPr>
+          <w:p>
+            <w:pPr>
+              <w:spacing w:before="0" w:after="20" w:line="259" w:lineRule="auto"/>
+            </w:pPr>
+            <w:r>
+              <w:rPr>
+                <w:rFonts w:ascii="Calibri" w:hAnsi="Calibri" w:eastAsia="Microsoft YaHei"/>
+                <w:color w:val="172033"/>
+                <w:sz w:val="19"/>
+              </w:rPr>
+              <w:t>警示框、暗黄吸能芯、粗斜纹</w:t>
+            </w:r>
+          </w:p>
+        </w:tc>
+        <w:tc>
+          <w:tcPr>
+            <w:tcW w:type="dxa" w:w="3860"/>
+            <w:tcMar>
+              <w:top w:w="80" w:type="dxa"/>
+              <w:start w:w="120" w:type="dxa"/>
+              <w:bottom w:w="80" w:type="dxa"/>
+              <w:end w:w="120" w:type="dxa"/>
+            </w:tcMar>
+            <w:vAlign w:val="center"/>
+          </w:tcPr>
+          <w:p>
+            <w:pPr>
+              <w:spacing w:before="0" w:after="20" w:line="259" w:lineRule="auto"/>
+            </w:pPr>
+            <w:r>
+              <w:rPr>
+                <w:rFonts w:ascii="Calibri" w:hAnsi="Calibri" w:eastAsia="Microsoft YaHei"/>
+                <w:color w:val="172033"/>
+                <w:sz w:val="19"/>
+              </w:rPr>
+              <w:t>吸收速度并导致失败</w:t>
+            </w:r>
+          </w:p>
+        </w:tc>
+      </w:tr>
+      <w:tr>
+        <w:tc>
+          <w:tcPr>
+            <w:tcW w:type="dxa" w:w="1600"/>
+            <w:tcMar>
+              <w:top w:w="80" w:type="dxa"/>
+              <w:start w:w="120" w:type="dxa"/>
+              <w:bottom w:w="80" w:type="dxa"/>
+              <w:end w:w="120" w:type="dxa"/>
+            </w:tcMar>
+            <w:vAlign w:val="center"/>
+          </w:tcPr>
+          <w:p>
+            <w:pPr>
+              <w:spacing w:before="0" w:after="20" w:line="259" w:lineRule="auto"/>
+              <w:jc w:val="center"/>
+            </w:pPr>
+            <w:r>
+              <w:rPr>
+                <w:rFonts w:ascii="Calibri" w:hAnsi="Calibri" w:eastAsia="Microsoft YaHei"/>
+                <w:color w:val="172033"/>
+                <w:sz w:val="19"/>
+              </w:rPr>
+              <w:t>移动机关</w:t>
+            </w:r>
+          </w:p>
+        </w:tc>
+        <w:tc>
+          <w:tcPr>
+            <w:tcW w:type="dxa" w:w="1600"/>
+            <w:tcMar>
+              <w:top w:w="80" w:type="dxa"/>
+              <w:start w:w="120" w:type="dxa"/>
+              <w:bottom w:w="80" w:type="dxa"/>
+              <w:end w:w="120" w:type="dxa"/>
+            </w:tcMar>
+            <w:vAlign w:val="center"/>
+          </w:tcPr>
+          <w:p>
+            <w:pPr>
+              <w:spacing w:before="0" w:after="20" w:line="259" w:lineRule="auto"/>
+            </w:pPr>
+            <w:r>
+              <w:rPr>
+                <w:rFonts w:ascii="Calibri" w:hAnsi="Calibri" w:eastAsia="Microsoft YaHei"/>
+                <w:color w:val="172033"/>
+                <w:sz w:val="19"/>
+              </w:rPr>
+              <w:t>琥珀色</w:t>
+            </w:r>
+          </w:p>
+        </w:tc>
+        <w:tc>
+          <w:tcPr>
+            <w:tcW w:type="dxa" w:w="2300"/>
+            <w:tcMar>
+              <w:top w:w="80" w:type="dxa"/>
+              <w:start w:w="120" w:type="dxa"/>
+              <w:bottom w:w="80" w:type="dxa"/>
+              <w:end w:w="120" w:type="dxa"/>
+            </w:tcMar>
+            <w:vAlign w:val="center"/>
+          </w:tcPr>
+          <w:p>
+            <w:pPr>
+              <w:spacing w:before="0" w:after="20" w:line="259" w:lineRule="auto"/>
+            </w:pPr>
+            <w:r>
+              <w:rPr>
+                <w:rFonts w:ascii="Calibri" w:hAnsi="Calibri" w:eastAsia="Microsoft YaHei"/>
+                <w:color w:val="172033"/>
+                <w:sz w:val="19"/>
+              </w:rPr>
+              <w:t>运动轨道、端点灯、机械轴心</w:t>
+            </w:r>
+          </w:p>
+        </w:tc>
+        <w:tc>
+          <w:tcPr>
+            <w:tcW w:type="dxa" w:w="3860"/>
+            <w:tcMar>
+              <w:top w:w="80" w:type="dxa"/>
+              <w:start w:w="120" w:type="dxa"/>
+              <w:bottom w:w="80" w:type="dxa"/>
+              <w:end w:w="120" w:type="dxa"/>
+            </w:tcMar>
+            <w:vAlign w:val="center"/>
+          </w:tcPr>
+          <w:p>
+            <w:pPr>
+              <w:spacing w:before="0" w:after="20" w:line="259" w:lineRule="auto"/>
+            </w:pPr>
+            <w:r>
+              <w:rPr>
+                <w:rFonts w:ascii="Calibri" w:hAnsi="Calibri" w:eastAsia="Microsoft YaHei"/>
+                <w:color w:val="172033"/>
+                <w:sz w:val="19"/>
+              </w:rPr>
+              <w:t>位置会随时间变化</w:t>
+            </w:r>
+          </w:p>
+        </w:tc>
+      </w:tr>
+      <w:tr>
+        <w:tc>
+          <w:tcPr>
+            <w:tcW w:type="dxa" w:w="1600"/>
+            <w:tcMar>
+              <w:top w:w="80" w:type="dxa"/>
+              <w:start w:w="120" w:type="dxa"/>
+              <w:bottom w:w="80" w:type="dxa"/>
+              <w:end w:w="120" w:type="dxa"/>
+            </w:tcMar>
+            <w:vAlign w:val="center"/>
+          </w:tcPr>
+          <w:p>
+            <w:pPr>
+              <w:spacing w:before="0" w:after="20" w:line="259" w:lineRule="auto"/>
+              <w:jc w:val="center"/>
+            </w:pPr>
+            <w:r>
+              <w:rPr>
+                <w:rFonts w:ascii="Calibri" w:hAnsi="Calibri" w:eastAsia="Microsoft YaHei"/>
+                <w:color w:val="172033"/>
+                <w:sz w:val="19"/>
+              </w:rPr>
+              <w:t>传送门</w:t>
+            </w:r>
+          </w:p>
+        </w:tc>
+        <w:tc>
+          <w:tcPr>
+            <w:tcW w:type="dxa" w:w="1600"/>
+            <w:tcMar>
+              <w:top w:w="80" w:type="dxa"/>
+              <w:start w:w="120" w:type="dxa"/>
+              <w:bottom w:w="80" w:type="dxa"/>
+              <w:end w:w="120" w:type="dxa"/>
+            </w:tcMar>
+            <w:vAlign w:val="center"/>
+          </w:tcPr>
+          <w:p>
+            <w:pPr>
+              <w:spacing w:before="0" w:after="20" w:line="259" w:lineRule="auto"/>
+            </w:pPr>
+            <w:r>
+              <w:rPr>
+                <w:rFonts w:ascii="Calibri" w:hAnsi="Calibri" w:eastAsia="Microsoft YaHei"/>
+                <w:color w:val="172033"/>
+                <w:sz w:val="19"/>
+              </w:rPr>
+              <w:t>蓝色/橙色</w:t>
+            </w:r>
+          </w:p>
+        </w:tc>
+        <w:tc>
+          <w:tcPr>
+            <w:tcW w:type="dxa" w:w="2300"/>
+            <w:tcMar>
+              <w:top w:w="80" w:type="dxa"/>
+              <w:start w:w="120" w:type="dxa"/>
+              <w:bottom w:w="80" w:type="dxa"/>
+              <w:end w:w="120" w:type="dxa"/>
+            </w:tcMar>
+            <w:vAlign w:val="center"/>
+          </w:tcPr>
+          <w:p>
+            <w:pPr>
+              <w:spacing w:before="0" w:after="20" w:line="259" w:lineRule="auto"/>
+            </w:pPr>
+            <w:r>
+              <w:rPr>
+                <w:rFonts w:ascii="Calibri" w:hAnsi="Calibri" w:eastAsia="Microsoft YaHei"/>
+                <w:color w:val="172033"/>
+                <w:sz w:val="19"/>
+              </w:rPr>
+              <w:t>深色机械外环、差速分段环、中心空间孔</w:t>
+            </w:r>
+          </w:p>
+        </w:tc>
+        <w:tc>
+          <w:tcPr>
+            <w:tcW w:type="dxa" w:w="3860"/>
+            <w:tcMar>
+              <w:top w:w="80" w:type="dxa"/>
+              <w:start w:w="120" w:type="dxa"/>
+              <w:bottom w:w="80" w:type="dxa"/>
+              <w:end w:w="120" w:type="dxa"/>
+            </w:tcMar>
+            <w:vAlign w:val="center"/>
+          </w:tcPr>
+          <w:p>
+            <w:pPr>
+              <w:spacing w:before="0" w:after="20" w:line="259" w:lineRule="auto"/>
+            </w:pPr>
+            <w:r>
+              <w:rPr>
+                <w:rFonts w:ascii="Calibri" w:hAnsi="Calibri" w:eastAsia="Microsoft YaHei"/>
+                <w:color w:val="172033"/>
+                <w:sz w:val="19"/>
+              </w:rPr>
+              <w:t>成对传送与出口方向</w:t>
+            </w:r>
+          </w:p>
+        </w:tc>
+      </w:tr>
+      <w:tr>
+        <w:tc>
+          <w:tcPr>
+            <w:tcW w:type="dxa" w:w="1600"/>
+            <w:tcMar>
+              <w:top w:w="80" w:type="dxa"/>
+              <w:start w:w="120" w:type="dxa"/>
+              <w:bottom w:w="80" w:type="dxa"/>
+              <w:end w:w="120" w:type="dxa"/>
+            </w:tcMar>
+            <w:vAlign w:val="center"/>
+          </w:tcPr>
+          <w:p>
+            <w:pPr>
+              <w:spacing w:before="0" w:after="20" w:line="259" w:lineRule="auto"/>
+              <w:jc w:val="center"/>
+            </w:pPr>
+            <w:r>
+              <w:rPr>
+                <w:rFonts w:ascii="Calibri" w:hAnsi="Calibri" w:eastAsia="Microsoft YaHei"/>
+                <w:color w:val="172033"/>
+                <w:sz w:val="19"/>
+              </w:rPr>
+              <w:t>开关与门</w:t>
+            </w:r>
+          </w:p>
+        </w:tc>
+        <w:tc>
+          <w:tcPr>
+            <w:tcW w:type="dxa" w:w="1600"/>
+            <w:tcMar>
+              <w:top w:w="80" w:type="dxa"/>
+              <w:start w:w="120" w:type="dxa"/>
+              <w:bottom w:w="80" w:type="dxa"/>
+              <w:end w:w="120" w:type="dxa"/>
+            </w:tcMar>
+            <w:vAlign w:val="center"/>
+          </w:tcPr>
+          <w:p>
+            <w:pPr>
+              <w:spacing w:before="0" w:after="20" w:line="259" w:lineRule="auto"/>
+            </w:pPr>
+            <w:r>
+              <w:rPr>
+                <w:rFonts w:ascii="Calibri" w:hAnsi="Calibri" w:eastAsia="Microsoft YaHei"/>
+                <w:color w:val="172033"/>
+                <w:sz w:val="19"/>
+              </w:rPr>
+              <w:t>红色</w:t>
+            </w:r>
+          </w:p>
+        </w:tc>
+        <w:tc>
+          <w:tcPr>
+            <w:tcW w:type="dxa" w:w="2300"/>
+            <w:tcMar>
+              <w:top w:w="80" w:type="dxa"/>
+              <w:start w:w="120" w:type="dxa"/>
+              <w:bottom w:w="80" w:type="dxa"/>
+              <w:end w:w="120" w:type="dxa"/>
+            </w:tcMar>
+            <w:vAlign w:val="center"/>
+          </w:tcPr>
+          <w:p>
+            <w:pPr>
+              <w:spacing w:before="0" w:after="20" w:line="259" w:lineRule="auto"/>
+            </w:pPr>
+            <w:r>
+              <w:rPr>
+                <w:rFonts w:ascii="Calibri" w:hAnsi="Calibri" w:eastAsia="Microsoft YaHei"/>
+                <w:color w:val="172033"/>
+                <w:sz w:val="19"/>
+              </w:rPr>
+              <w:t>同色电路线、OFF/ON 状态窗、工业闸门</w:t>
+            </w:r>
+          </w:p>
+        </w:tc>
+        <w:tc>
+          <w:tcPr>
+            <w:tcW w:type="dxa" w:w="3860"/>
+            <w:tcMar>
+              <w:top w:w="80" w:type="dxa"/>
+              <w:start w:w="120" w:type="dxa"/>
+              <w:bottom w:w="80" w:type="dxa"/>
+              <w:end w:w="120" w:type="dxa"/>
+            </w:tcMar>
+            <w:vAlign w:val="center"/>
+          </w:tcPr>
+          <w:p>
+            <w:pPr>
+              <w:spacing w:before="0" w:after="20" w:line="259" w:lineRule="auto"/>
+            </w:pPr>
+            <w:r>
+              <w:rPr>
+                <w:rFonts w:ascii="Calibri" w:hAnsi="Calibri" w:eastAsia="Microsoft YaHei"/>
+                <w:color w:val="172033"/>
+                <w:sz w:val="19"/>
+              </w:rPr>
+              <w:t>开关控制门</w:t>
+            </w:r>
+          </w:p>
+        </w:tc>
+      </w:tr>
+      <w:tr>
+        <w:tc>
+          <w:tcPr>
+            <w:tcW w:type="dxa" w:w="1600"/>
+            <w:tcMar>
+              <w:top w:w="80" w:type="dxa"/>
+              <w:start w:w="120" w:type="dxa"/>
+              <w:bottom w:w="80" w:type="dxa"/>
+              <w:end w:w="120" w:type="dxa"/>
+            </w:tcMar>
+            <w:vAlign w:val="center"/>
+          </w:tcPr>
+          <w:p>
+            <w:pPr>
+              <w:spacing w:before="0" w:after="20" w:line="259" w:lineRule="auto"/>
+              <w:jc w:val="center"/>
+            </w:pPr>
+            <w:r>
+              <w:rPr>
+                <w:rFonts w:ascii="Calibri" w:hAnsi="Calibri" w:eastAsia="Microsoft YaHei"/>
+                <w:color w:val="172033"/>
+                <w:sz w:val="19"/>
+              </w:rPr>
+              <w:t>B 点</w:t>
+            </w:r>
+          </w:p>
+        </w:tc>
+        <w:tc>
+          <w:tcPr>
+            <w:tcW w:type="dxa" w:w="1600"/>
+            <w:tcMar>
+              <w:top w:w="80" w:type="dxa"/>
+              <w:start w:w="120" w:type="dxa"/>
+              <w:bottom w:w="80" w:type="dxa"/>
+              <w:end w:w="120" w:type="dxa"/>
+            </w:tcMar>
+            <w:vAlign w:val="center"/>
+          </w:tcPr>
+          <w:p>
+            <w:pPr>
+              <w:spacing w:before="0" w:after="20" w:line="259" w:lineRule="auto"/>
+            </w:pPr>
+            <w:r>
+              <w:rPr>
+                <w:rFonts w:ascii="Calibri" w:hAnsi="Calibri" w:eastAsia="Microsoft YaHei"/>
+                <w:color w:val="172033"/>
+                <w:sz w:val="19"/>
+              </w:rPr>
+              <w:t>薄荷绿</w:t>
+            </w:r>
+          </w:p>
+        </w:tc>
+        <w:tc>
+          <w:tcPr>
+            <w:tcW w:type="dxa" w:w="2300"/>
+            <w:tcMar>
+              <w:top w:w="80" w:type="dxa"/>
+              <w:start w:w="120" w:type="dxa"/>
+              <w:bottom w:w="80" w:type="dxa"/>
+              <w:end w:w="120" w:type="dxa"/>
+            </w:tcMar>
+            <w:vAlign w:val="center"/>
+          </w:tcPr>
+          <w:p>
+            <w:pPr>
+              <w:spacing w:before="0" w:after="20" w:line="259" w:lineRule="auto"/>
+            </w:pPr>
+            <w:r>
+              <w:rPr>
+                <w:rFonts w:ascii="Calibri" w:hAnsi="Calibri" w:eastAsia="Microsoft YaHei"/>
+                <w:color w:val="172033"/>
+                <w:sz w:val="19"/>
+              </w:rPr>
+              <w:t>同心目标环、旋转刻度、四向锁定标记</w:t>
+            </w:r>
+          </w:p>
+        </w:tc>
+        <w:tc>
+          <w:tcPr>
+            <w:tcW w:type="dxa" w:w="3860"/>
+            <w:tcMar>
+              <w:top w:w="80" w:type="dxa"/>
+              <w:start w:w="120" w:type="dxa"/>
+              <w:bottom w:w="80" w:type="dxa"/>
+              <w:end w:w="120" w:type="dxa"/>
+            </w:tcMar>
+            <w:vAlign w:val="center"/>
+          </w:tcPr>
+          <w:p>
+            <w:pPr>
+              <w:spacing w:before="0" w:after="20" w:line="259" w:lineRule="auto"/>
+            </w:pPr>
+            <w:r>
+              <w:rPr>
+                <w:rFonts w:ascii="Calibri" w:hAnsi="Calibri" w:eastAsia="Microsoft YaHei"/>
+                <w:color w:val="172033"/>
+                <w:sz w:val="19"/>
+              </w:rPr>
+              <w:t>关卡唯一胜利目标</w:t>
+            </w:r>
+          </w:p>
+        </w:tc>
+      </w:tr>
+      <w:tr>
+        <w:tc>
+          <w:tcPr>
+            <w:tcW w:type="dxa" w:w="1600"/>
+            <w:tcMar>
+              <w:top w:w="80" w:type="dxa"/>
+              <w:start w:w="120" w:type="dxa"/>
+              <w:bottom w:w="80" w:type="dxa"/>
+              <w:end w:w="120" w:type="dxa"/>
+            </w:tcMar>
+            <w:vAlign w:val="center"/>
+          </w:tcPr>
+          <w:p>
+            <w:pPr>
+              <w:spacing w:before="0" w:after="20" w:line="259" w:lineRule="auto"/>
+              <w:jc w:val="center"/>
+            </w:pPr>
+            <w:r>
+              <w:rPr>
+                <w:rFonts w:ascii="Calibri" w:hAnsi="Calibri" w:eastAsia="Microsoft YaHei"/>
+                <w:color w:val="172033"/>
+                <w:sz w:val="19"/>
+              </w:rPr>
+              <w:t>弹珠</w:t>
+            </w:r>
+          </w:p>
+        </w:tc>
+        <w:tc>
+          <w:tcPr>
+            <w:tcW w:type="dxa" w:w="1600"/>
+            <w:tcMar>
+              <w:top w:w="80" w:type="dxa"/>
+              <w:start w:w="120" w:type="dxa"/>
+              <w:bottom w:w="80" w:type="dxa"/>
+              <w:end w:w="120" w:type="dxa"/>
+            </w:tcMar>
+            <w:vAlign w:val="center"/>
+          </w:tcPr>
+          <w:p>
+            <w:pPr>
+              <w:spacing w:before="0" w:after="20" w:line="259" w:lineRule="auto"/>
+            </w:pPr>
+            <w:r>
+              <w:rPr>
+                <w:rFonts w:ascii="Calibri" w:hAnsi="Calibri" w:eastAsia="Microsoft YaHei"/>
+                <w:color w:val="172033"/>
+                <w:sz w:val="19"/>
+              </w:rPr>
+              <w:t>白银与青色</w:t>
+            </w:r>
+          </w:p>
+        </w:tc>
+        <w:tc>
+          <w:tcPr>
+            <w:tcW w:type="dxa" w:w="2300"/>
+            <w:tcMar>
+              <w:top w:w="80" w:type="dxa"/>
+              <w:start w:w="120" w:type="dxa"/>
+              <w:bottom w:w="80" w:type="dxa"/>
+              <w:end w:w="120" w:type="dxa"/>
+            </w:tcMar>
+            <w:vAlign w:val="center"/>
+          </w:tcPr>
+          <w:p>
+            <w:pPr>
+              <w:spacing w:before="0" w:after="20" w:line="259" w:lineRule="auto"/>
+            </w:pPr>
+            <w:r>
+              <w:rPr>
+                <w:rFonts w:ascii="Calibri" w:hAnsi="Calibri" w:eastAsia="Microsoft YaHei"/>
+                <w:color w:val="172033"/>
+                <w:sz w:val="19"/>
+              </w:rPr>
+              <w:t>金属径向高光、细光带尾迹</w:t>
+            </w:r>
+          </w:p>
+        </w:tc>
+        <w:tc>
+          <w:tcPr>
+            <w:tcW w:type="dxa" w:w="3860"/>
+            <w:tcMar>
+              <w:top w:w="80" w:type="dxa"/>
+              <w:start w:w="120" w:type="dxa"/>
+              <w:bottom w:w="80" w:type="dxa"/>
+              <w:end w:w="120" w:type="dxa"/>
+            </w:tcMar>
+            <w:vAlign w:val="center"/>
+          </w:tcPr>
+          <w:p>
+            <w:pPr>
+              <w:spacing w:before="0" w:after="20" w:line="259" w:lineRule="auto"/>
+            </w:pPr>
+            <w:r>
+              <w:rPr>
+                <w:rFonts w:ascii="Calibri" w:hAnsi="Calibri" w:eastAsia="Microsoft YaHei"/>
+                <w:color w:val="172033"/>
+                <w:sz w:val="19"/>
+              </w:rPr>
+              <w:t>场上最清晰的运动主体</w:t>
+            </w:r>
+          </w:p>
+        </w:tc>
+      </w:tr>
+    </w:tbl>
+    <w:p>
+      <w:pPr>
+        <w:spacing w:after="40"/>
+      </w:pPr>
+    </w:p>
+    <w:p>
+      <w:pPr>
+        <w:pStyle w:val="Heading2"/>
+      </w:pPr>
+      <w:r>
+        <w:rPr>
+          <w:rFonts w:ascii="Calibri" w:hAnsi="Calibri" w:eastAsia="Microsoft YaHei"/>
+          <w:b/>
+          <w:color w:val="2E74B5"/>
+          <w:sz w:val="26"/>
+        </w:rPr>
+        <w:t>11.3 开始界面</w:t>
       </w:r>
     </w:p>
     <w:p>
@@ -6018,7 +7299,7 @@
           <w:color w:val="172033"/>
           <w:sz w:val="22"/>
         </w:rPr>
-        <w:t>标题有缓慢呼吸灯效果。</w:t>
+        <w:t>背景为暗色霓虹弹球封面图。</w:t>
       </w:r>
     </w:p>
     <w:p>
@@ -6035,21 +7316,7 @@
           <w:color w:val="172033"/>
           <w:sz w:val="22"/>
         </w:rPr>
-        <w:t>标题下方只有“开始游戏”和“退出游戏”两个主要按钮。</w:t>
-      </w:r>
-    </w:p>
-    <w:p>
-      <w:pPr>
-        <w:pStyle w:val="Heading2"/>
-      </w:pPr>
-      <w:r>
-        <w:rPr>
-          <w:rFonts w:ascii="Calibri" w:hAnsi="Calibri" w:eastAsia="Microsoft YaHei"/>
-          <w:b/>
-          <w:color w:val="2E74B5"/>
-          <w:sz w:val="26"/>
-        </w:rPr>
-        <w:t>11.3 关卡菜单</w:t>
+        <w:t>标题“弹珠”为艺术拼接字，并带弹珠滑过字面的轨道感。</w:t>
       </w:r>
     </w:p>
     <w:p>
@@ -6066,7 +7333,7 @@
           <w:color w:val="172033"/>
           <w:sz w:val="22"/>
         </w:rPr>
-        <w:t>继续使用开始界面的封面作为背景。</w:t>
+        <w:t>标题有缓慢呼吸灯效果。</w:t>
       </w:r>
     </w:p>
     <w:p>
@@ -6083,7 +7350,21 @@
           <w:color w:val="172033"/>
           <w:sz w:val="22"/>
         </w:rPr>
-        <w:t>前景采用液态玻璃或毛玻璃效果。</w:t>
+        <w:t>标题下方只有“开始游戏”和“退出游戏”两个主要按钮。</w:t>
+      </w:r>
+    </w:p>
+    <w:p>
+      <w:pPr>
+        <w:pStyle w:val="Heading2"/>
+      </w:pPr>
+      <w:r>
+        <w:rPr>
+          <w:rFonts w:ascii="Calibri" w:hAnsi="Calibri" w:eastAsia="Microsoft YaHei"/>
+          <w:b/>
+          <w:color w:val="2E74B5"/>
+          <w:sz w:val="26"/>
+        </w:rPr>
+        <w:t>11.4 关卡菜单</w:t>
       </w:r>
     </w:p>
     <w:p>
@@ -6100,7 +7381,7 @@
           <w:color w:val="172033"/>
           <w:sz w:val="22"/>
         </w:rPr>
-        <w:t>官方关卡按顺序编号，每行 5 个正方形入口。</w:t>
+        <w:t>继续使用开始界面的封面作为背景。</w:t>
       </w:r>
     </w:p>
     <w:p>
@@ -6117,7 +7398,7 @@
           <w:color w:val="172033"/>
           <w:sz w:val="22"/>
         </w:rPr>
-        <w:t>关卡入口位于独立的纵向滚动窗口中，上方标题与编辑器入口保持固定。</w:t>
+        <w:t>前景采用液态玻璃或毛玻璃效果。</w:t>
       </w:r>
     </w:p>
     <w:p>
@@ -6134,7 +7415,7 @@
           <w:color w:val="172033"/>
           <w:sz w:val="22"/>
         </w:rPr>
-        <w:t>玩家可以使用鼠标滚轮、触控板、触摸滑动或拖动右侧滚动条浏览全部关卡。</w:t>
+        <w:t>官方关卡按顺序编号，每行 5 个正方形入口。</w:t>
       </w:r>
     </w:p>
     <w:p>
@@ -6151,7 +7432,7 @@
           <w:color w:val="172033"/>
           <w:sz w:val="22"/>
         </w:rPr>
-        <w:t>已完成、当前、自定义和已编辑关卡有不同边框或状态色。</w:t>
+        <w:t>关卡入口位于独立的纵向滚动窗口中，上方标题与编辑器入口保持固定。</w:t>
       </w:r>
     </w:p>
     <w:p>
@@ -6168,21 +7449,7 @@
           <w:color w:val="172033"/>
           <w:sz w:val="22"/>
         </w:rPr>
-        <w:t>玩家可以自由选择任意关卡。</w:t>
-      </w:r>
-    </w:p>
-    <w:p>
-      <w:pPr>
-        <w:pStyle w:val="Heading2"/>
-      </w:pPr>
-      <w:r>
-        <w:rPr>
-          <w:rFonts w:ascii="Calibri" w:hAnsi="Calibri" w:eastAsia="Microsoft YaHei"/>
-          <w:b/>
-          <w:color w:val="2E74B5"/>
-          <w:sz w:val="26"/>
-        </w:rPr>
-        <w:t>11.4 游玩界面</w:t>
+        <w:t>玩家可以使用鼠标滚轮、触控板、触摸滑动或拖动右侧滚动条浏览全部关卡。</w:t>
       </w:r>
     </w:p>
     <w:p>
@@ -6199,7 +7466,7 @@
           <w:color w:val="172033"/>
           <w:sz w:val="22"/>
         </w:rPr>
-        <w:t>左侧为主要箱庭画布，右侧为紧凑控制面板。</w:t>
+        <w:t>关卡卡片使用深色金属面板、青色顶部状态条和工业角标；长名称限制在稳定的两行区域内。</w:t>
       </w:r>
     </w:p>
     <w:p>
@@ -6216,7 +7483,7 @@
           <w:color w:val="172033"/>
           <w:sz w:val="22"/>
         </w:rPr>
-        <w:t>控制面板显示关卡编号、名称、考验方向和当前发射器。</w:t>
+        <w:t>已完成、当前、自定义和已编辑关卡使用不同边框及状态条，不只依靠文字区分。</w:t>
       </w:r>
     </w:p>
     <w:p>
@@ -6233,7 +7500,21 @@
           <w:color w:val="172033"/>
           <w:sz w:val="22"/>
         </w:rPr>
-        <w:t>发射器状态按钮直接显示有球或空。</w:t>
+        <w:t>玩家可以自由选择任意关卡。</w:t>
+      </w:r>
+    </w:p>
+    <w:p>
+      <w:pPr>
+        <w:pStyle w:val="Heading2"/>
+      </w:pPr>
+      <w:r>
+        <w:rPr>
+          <w:rFonts w:ascii="Calibri" w:hAnsi="Calibri" w:eastAsia="Microsoft YaHei"/>
+          <w:b/>
+          <w:color w:val="2E74B5"/>
+          <w:sz w:val="26"/>
+        </w:rPr>
+        <w:t>11.5 游玩界面</w:t>
       </w:r>
     </w:p>
     <w:p>
@@ -6250,7 +7531,224 @@
           <w:color w:val="172033"/>
           <w:sz w:val="22"/>
         </w:rPr>
+        <w:t>左侧为主要箱庭画布，右侧为紧凑控制面板。</w:t>
+      </w:r>
+    </w:p>
+    <w:p>
+      <w:pPr>
+        <w:spacing w:after="80" w:line="300" w:lineRule="auto"/>
+        <w:numPr>
+          <w:ilvl w:val="0"/>
+          <w:numId w:val="10"/>
+        </w:numPr>
+      </w:pPr>
+      <w:r>
+        <w:rPr>
+          <w:rFonts w:ascii="Calibri" w:hAnsi="Calibri" w:eastAsia="Microsoft YaHei"/>
+          <w:color w:val="172033"/>
+          <w:sz w:val="22"/>
+        </w:rPr>
+        <w:t>控制面板显示关卡编号、名称、考验方向和当前发射器。</w:t>
+      </w:r>
+    </w:p>
+    <w:p>
+      <w:pPr>
+        <w:spacing w:after="80" w:line="300" w:lineRule="auto"/>
+        <w:numPr>
+          <w:ilvl w:val="0"/>
+          <w:numId w:val="10"/>
+        </w:numPr>
+      </w:pPr>
+      <w:r>
+        <w:rPr>
+          <w:rFonts w:ascii="Calibri" w:hAnsi="Calibri" w:eastAsia="Microsoft YaHei"/>
+          <w:color w:val="172033"/>
+          <w:sz w:val="22"/>
+        </w:rPr>
+        <w:t>发射器状态按钮直接显示有球或空。</w:t>
+      </w:r>
+    </w:p>
+    <w:p>
+      <w:pPr>
+        <w:spacing w:after="80" w:line="300" w:lineRule="auto"/>
+        <w:numPr>
+          <w:ilvl w:val="0"/>
+          <w:numId w:val="10"/>
+        </w:numPr>
+      </w:pPr>
+      <w:r>
+        <w:rPr>
+          <w:rFonts w:ascii="Calibri" w:hAnsi="Calibri" w:eastAsia="Microsoft YaHei"/>
+          <w:color w:val="172033"/>
+          <w:sz w:val="22"/>
+        </w:rPr>
         <w:t>发射、重置、返回菜单和编辑当前关卡均有明确入口。</w:t>
+      </w:r>
+    </w:p>
+    <w:p>
+      <w:pPr>
+        <w:spacing w:after="80" w:line="300" w:lineRule="auto"/>
+        <w:numPr>
+          <w:ilvl w:val="0"/>
+          <w:numId w:val="10"/>
+        </w:numPr>
+      </w:pPr>
+      <w:r>
+        <w:rPr>
+          <w:rFonts w:ascii="Calibri" w:hAnsi="Calibri" w:eastAsia="Microsoft YaHei"/>
+          <w:color w:val="172033"/>
+          <w:sz w:val="22"/>
+        </w:rPr>
+        <w:t>控制面板采用深色机械控制台材质，青色负责数值与焦点，绿色只用于可发射状态和主要操作。</w:t>
+      </w:r>
+    </w:p>
+    <w:p>
+      <w:pPr>
+        <w:spacing w:after="80" w:line="300" w:lineRule="auto"/>
+        <w:numPr>
+          <w:ilvl w:val="0"/>
+          <w:numId w:val="10"/>
+        </w:numPr>
+      </w:pPr>
+      <w:r>
+        <w:rPr>
+          <w:rFonts w:ascii="Calibri" w:hAnsi="Calibri" w:eastAsia="Microsoft YaHei"/>
+          <w:color w:val="172033"/>
+          <w:sz w:val="22"/>
+        </w:rPr>
+        <w:t>滑杆使用定制轨道与高亮滑块，输入框、按钮、弹窗和编辑器共享同一套边框及焦点规则。</w:t>
+      </w:r>
+    </w:p>
+    <w:p>
+      <w:pPr>
+        <w:spacing w:after="80" w:line="300" w:lineRule="auto"/>
+        <w:numPr>
+          <w:ilvl w:val="0"/>
+          <w:numId w:val="10"/>
+        </w:numPr>
+      </w:pPr>
+      <w:r>
+        <w:rPr>
+          <w:rFonts w:ascii="Calibri" w:hAnsi="Calibri" w:eastAsia="Microsoft YaHei"/>
+          <w:color w:val="172033"/>
+          <w:sz w:val="22"/>
+        </w:rPr>
+        <w:t>手机端采用自然页面滚动，避免编辑器面板与页面形成双层滚动。</w:t>
+      </w:r>
+    </w:p>
+    <w:p>
+      <w:pPr>
+        <w:pStyle w:val="Heading2"/>
+      </w:pPr>
+      <w:r>
+        <w:rPr>
+          <w:rFonts w:ascii="Calibri" w:hAnsi="Calibri" w:eastAsia="Microsoft YaHei"/>
+          <w:b/>
+          <w:color w:val="2E74B5"/>
+          <w:sz w:val="26"/>
+        </w:rPr>
+        <w:t>11.6 动效与可访问性</w:t>
+      </w:r>
+    </w:p>
+    <w:p>
+      <w:pPr>
+        <w:spacing w:after="80" w:line="300" w:lineRule="auto"/>
+        <w:numPr>
+          <w:ilvl w:val="0"/>
+          <w:numId w:val="10"/>
+        </w:numPr>
+      </w:pPr>
+      <w:r>
+        <w:rPr>
+          <w:rFonts w:ascii="Calibri" w:hAnsi="Calibri" w:eastAsia="Microsoft YaHei"/>
+          <w:color w:val="172033"/>
+          <w:sz w:val="22"/>
+        </w:rPr>
+        <w:t>界面悬停和按压反馈控制在 70 至 160 毫秒；有球发射器使用低频旋转或呼吸灯。</w:t>
+      </w:r>
+    </w:p>
+    <w:p>
+      <w:pPr>
+        <w:spacing w:after="80" w:line="300" w:lineRule="auto"/>
+        <w:numPr>
+          <w:ilvl w:val="0"/>
+          <w:numId w:val="10"/>
+        </w:numPr>
+      </w:pPr>
+      <w:r>
+        <w:rPr>
+          <w:rFonts w:ascii="Calibri" w:hAnsi="Calibri" w:eastAsia="Microsoft YaHei"/>
+          <w:color w:val="172033"/>
+          <w:sz w:val="22"/>
+        </w:rPr>
+        <w:t>传送门分段环持续缓慢差速旋转；开关线路通过流动虚线表示电路关系。</w:t>
+      </w:r>
+    </w:p>
+    <w:p>
+      <w:pPr>
+        <w:spacing w:after="80" w:line="300" w:lineRule="auto"/>
+        <w:numPr>
+          <w:ilvl w:val="0"/>
+          <w:numId w:val="10"/>
+        </w:numPr>
+      </w:pPr>
+      <w:r>
+        <w:rPr>
+          <w:rFonts w:ascii="Calibri" w:hAnsi="Calibri" w:eastAsia="Microsoft YaHei"/>
+          <w:color w:val="172033"/>
+          <w:sz w:val="22"/>
+        </w:rPr>
+        <w:t>发射、碰撞、接球、传送和通关可以短暂提高亮度，但不能长期保持最高级光晕。</w:t>
+      </w:r>
+    </w:p>
+    <w:p>
+      <w:pPr>
+        <w:spacing w:after="80" w:line="300" w:lineRule="auto"/>
+        <w:numPr>
+          <w:ilvl w:val="0"/>
+          <w:numId w:val="10"/>
+        </w:numPr>
+      </w:pPr>
+      <w:r>
+        <w:rPr>
+          <w:rFonts w:ascii="Calibri" w:hAnsi="Calibri" w:eastAsia="Microsoft YaHei"/>
+          <w:color w:val="172033"/>
+          <w:sz w:val="22"/>
+        </w:rPr>
+        <w:t>预测线和失败轨迹保持细线，不使用会遮挡解谜路线的大面积光效。</w:t>
+      </w:r>
+    </w:p>
+    <w:p>
+      <w:pPr>
+        <w:spacing w:after="80" w:line="300" w:lineRule="auto"/>
+        <w:numPr>
+          <w:ilvl w:val="0"/>
+          <w:numId w:val="10"/>
+        </w:numPr>
+      </w:pPr>
+      <w:r>
+        <w:rPr>
+          <w:rFonts w:ascii="Calibri" w:hAnsi="Calibri" w:eastAsia="Microsoft YaHei"/>
+          <w:color w:val="172033"/>
+          <w:sz w:val="22"/>
+        </w:rPr>
+        <w:t xml:space="preserve">所有 CSS 装饰动画继续支持 </w:t>
+      </w:r>
+      <w:r>
+        <w:rPr>
+          <w:rFonts w:ascii="Consolas" w:hAnsi="Consolas" w:eastAsia="Microsoft YaHei"/>
+          <w:color w:val="1F4D78"/>
+          <w:sz w:val="21"/>
+        </w:rPr>
+        <w:t>prefers-reduced-motion</w:t>
+      </w:r>
+      <w:r>
+        <w:rPr>
+          <w:rFonts w:ascii="Calibri" w:hAnsi="Calibri" w:eastAsia="Microsoft YaHei"/>
+          <w:color w:val="172033"/>
+          <w:sz w:val="22"/>
+        </w:rPr>
+        <w:t>，键盘焦点使用明确的青色双层轮廓。</w:t>
       </w:r>
     </w:p>
     <w:p>

</xml_diff>